<commit_message>
Add section 6.4: breakdown of the first-workflow-live estimate
Sets out the composition of the 30-52 engineering-week P1 figure: the
workflow module itself is 3-5 weeks and the remainder is foundation
required by the M01-M12 dependency register. Records the pilot-grade
reduction option and why it is not recommended.

Co-Authored-By: Claude Opus 5 <noreply@anthropic.com>
Claude-Session: https://claude.ai/code/session_01RrKP4hmZRECbrpNkbcdKPF
</commit_message>
<xml_diff>
--- a/documentation/HaloFlow_Product_Decisions_Demo_Scope_and_Estimate_v1.docx
+++ b/documentation/HaloFlow_Product_Decisions_Demo_Scope_and_Estimate_v1.docx
@@ -5737,6 +5737,1009 @@
           <w:szCs w:val="20"/>
         </w:rPr>
         <w:t xml:space="preserve">If the Phase 1 horizon is unacceptable, the available levers are: increase hours per week; reduce the first clinic’s live scope to fewer workflows while still demonstrating all four in the demo; narrow the M10 interface scope; or reduce the assurance process for non-PHI paths. The last of these should be considered carefully and probably rejected.</w:t>
+      </w:r>
+    </w:p>
+    <w:p>
+      <w:pPr>
+        <w:pStyle w:val="Heading2"/>
+        <w:spacing w:after="140" w:before="280"/>
+      </w:pPr>
+      <w:r>
+        <w:t xml:space="preserve">6.4 Why the first workflow costs what it does</w:t>
+      </w:r>
+    </w:p>
+    <w:p>
+      <w:pPr>
+        <w:spacing w:after="120"/>
+      </w:pPr>
+      <w:r>
+        <w:t xml:space="preserve">The P1 figure is the one most worth challenging, so its composition is set out here in full.</w:t>
+      </w:r>
+    </w:p>
+    <w:tbl>
+      <w:tblPr>
+        <w:tblW w:type="dxa" w:w="9360"/>
+        <w:tblBorders>
+          <w:top w:val="single" w:color="auto" w:sz="4"/>
+          <w:left w:val="single" w:color="auto" w:sz="4"/>
+          <w:bottom w:val="single" w:color="auto" w:sz="4"/>
+          <w:right w:val="single" w:color="auto" w:sz="4"/>
+          <w:insideH w:val="single" w:color="auto" w:sz="4"/>
+          <w:insideV w:val="single" w:color="auto" w:sz="4"/>
+        </w:tblBorders>
+      </w:tblPr>
+      <w:tblGrid>
+        <w:gridCol w:w="4600"/>
+        <w:gridCol w:w="1500"/>
+        <w:gridCol w:w="3260"/>
+      </w:tblGrid>
+      <w:tr>
+        <w:trPr>
+          <w:tblHeader/>
+        </w:trPr>
+        <w:tc>
+          <w:tcPr>
+            <w:tcW w:type="dxa" w:w="4600"/>
+            <w:shd w:fill="E8EDF2" w:color="auto" w:val="clear"/>
+            <w:tcMar>
+              <w:top w:type="dxa" w:w="80"/>
+              <w:left w:type="dxa" w:w="120"/>
+              <w:bottom w:type="dxa" w:w="80"/>
+              <w:right w:type="dxa" w:w="120"/>
+            </w:tcMar>
+          </w:tcPr>
+          <w:p>
+            <w:pPr>
+              <w:spacing w:after="0"/>
+            </w:pPr>
+            <w:r>
+              <w:rPr>
+                <w:b/>
+                <w:bCs/>
+                <w:sz w:val="19"/>
+                <w:szCs w:val="19"/>
+              </w:rPr>
+              <w:t xml:space="preserve">Component</w:t>
+            </w:r>
+          </w:p>
+        </w:tc>
+        <w:tc>
+          <w:tcPr>
+            <w:tcW w:type="dxa" w:w="1500"/>
+            <w:shd w:fill="E8EDF2" w:color="auto" w:val="clear"/>
+            <w:tcMar>
+              <w:top w:type="dxa" w:w="80"/>
+              <w:left w:type="dxa" w:w="120"/>
+              <w:bottom w:type="dxa" w:w="80"/>
+              <w:right w:type="dxa" w:w="120"/>
+            </w:tcMar>
+          </w:tcPr>
+          <w:p>
+            <w:pPr>
+              <w:spacing w:after="0"/>
+            </w:pPr>
+            <w:r>
+              <w:rPr>
+                <w:b/>
+                <w:bCs/>
+                <w:sz w:val="19"/>
+                <w:szCs w:val="19"/>
+              </w:rPr>
+              <w:t xml:space="preserve">Eng-weeks</w:t>
+            </w:r>
+          </w:p>
+        </w:tc>
+        <w:tc>
+          <w:tcPr>
+            <w:tcW w:type="dxa" w:w="3260"/>
+            <w:shd w:fill="E8EDF2" w:color="auto" w:val="clear"/>
+            <w:tcMar>
+              <w:top w:type="dxa" w:w="80"/>
+              <w:left w:type="dxa" w:w="120"/>
+              <w:bottom w:type="dxa" w:w="80"/>
+              <w:right w:type="dxa" w:w="120"/>
+            </w:tcMar>
+          </w:tcPr>
+          <w:p>
+            <w:pPr>
+              <w:spacing w:after="0"/>
+            </w:pPr>
+            <w:r>
+              <w:rPr>
+                <w:b/>
+                <w:bCs/>
+                <w:sz w:val="19"/>
+                <w:szCs w:val="19"/>
+              </w:rPr>
+              <w:t xml:space="preserve">Category</w:t>
+            </w:r>
+          </w:p>
+        </w:tc>
+      </w:tr>
+      <w:tr>
+        <w:tc>
+          <w:tcPr>
+            <w:tcW w:type="dxa" w:w="4600"/>
+            <w:tcMar>
+              <w:top w:type="dxa" w:w="80"/>
+              <w:left w:type="dxa" w:w="120"/>
+              <w:bottom w:type="dxa" w:w="80"/>
+              <w:right w:type="dxa" w:w="120"/>
+            </w:tcMar>
+          </w:tcPr>
+          <w:p>
+            <w:pPr>
+              <w:spacing w:after="0"/>
+            </w:pPr>
+            <w:r>
+              <w:rPr>
+                <w:b w:val="false"/>
+                <w:bCs w:val="false"/>
+                <w:sz w:val="19"/>
+                <w:szCs w:val="19"/>
+              </w:rPr>
+              <w:t xml:space="preserve">M01 debt PR</w:t>
+            </w:r>
+          </w:p>
+        </w:tc>
+        <w:tc>
+          <w:tcPr>
+            <w:tcW w:type="dxa" w:w="1500"/>
+            <w:tcMar>
+              <w:top w:type="dxa" w:w="80"/>
+              <w:left w:type="dxa" w:w="120"/>
+              <w:bottom w:type="dxa" w:w="80"/>
+              <w:right w:type="dxa" w:w="120"/>
+            </w:tcMar>
+          </w:tcPr>
+          <w:p>
+            <w:pPr>
+              <w:spacing w:after="0"/>
+            </w:pPr>
+            <w:r>
+              <w:rPr>
+                <w:b w:val="false"/>
+                <w:bCs w:val="false"/>
+                <w:sz w:val="19"/>
+                <w:szCs w:val="19"/>
+              </w:rPr>
+              <w:t xml:space="preserve">1.5 – 3</w:t>
+            </w:r>
+          </w:p>
+        </w:tc>
+        <w:tc>
+          <w:tcPr>
+            <w:tcW w:type="dxa" w:w="3260"/>
+            <w:tcMar>
+              <w:top w:type="dxa" w:w="80"/>
+              <w:left w:type="dxa" w:w="120"/>
+              <w:bottom w:type="dxa" w:w="80"/>
+              <w:right w:type="dxa" w:w="120"/>
+            </w:tcMar>
+          </w:tcPr>
+          <w:p>
+            <w:pPr>
+              <w:spacing w:after="0"/>
+            </w:pPr>
+            <w:r>
+              <w:rPr>
+                <w:b w:val="false"/>
+                <w:bCs w:val="false"/>
+                <w:sz w:val="19"/>
+                <w:szCs w:val="19"/>
+              </w:rPr>
+              <w:t xml:space="preserve">Foundation</w:t>
+            </w:r>
+          </w:p>
+        </w:tc>
+      </w:tr>
+      <w:tr>
+        <w:tc>
+          <w:tcPr>
+            <w:tcW w:type="dxa" w:w="4600"/>
+            <w:tcMar>
+              <w:top w:type="dxa" w:w="80"/>
+              <w:left w:type="dxa" w:w="120"/>
+              <w:bottom w:type="dxa" w:w="80"/>
+              <w:right w:type="dxa" w:w="120"/>
+            </w:tcMar>
+          </w:tcPr>
+          <w:p>
+            <w:pPr>
+              <w:spacing w:after="0"/>
+            </w:pPr>
+            <w:r>
+              <w:rPr>
+                <w:b w:val="false"/>
+                <w:bCs w:val="false"/>
+                <w:sz w:val="19"/>
+                <w:szCs w:val="19"/>
+              </w:rPr>
+              <w:t xml:space="preserve">M01 production readiness (legacy migration, identity, telemetry, runbooks)</w:t>
+            </w:r>
+          </w:p>
+        </w:tc>
+        <w:tc>
+          <w:tcPr>
+            <w:tcW w:type="dxa" w:w="1500"/>
+            <w:tcMar>
+              <w:top w:type="dxa" w:w="80"/>
+              <w:left w:type="dxa" w:w="120"/>
+              <w:bottom w:type="dxa" w:w="80"/>
+              <w:right w:type="dxa" w:w="120"/>
+            </w:tcMar>
+          </w:tcPr>
+          <w:p>
+            <w:pPr>
+              <w:spacing w:after="0"/>
+            </w:pPr>
+            <w:r>
+              <w:rPr>
+                <w:b w:val="false"/>
+                <w:bCs w:val="false"/>
+                <w:sz w:val="19"/>
+                <w:szCs w:val="19"/>
+              </w:rPr>
+              <w:t xml:space="preserve">3 – 6</w:t>
+            </w:r>
+          </w:p>
+        </w:tc>
+        <w:tc>
+          <w:tcPr>
+            <w:tcW w:type="dxa" w:w="3260"/>
+            <w:tcMar>
+              <w:top w:type="dxa" w:w="80"/>
+              <w:left w:type="dxa" w:w="120"/>
+              <w:bottom w:type="dxa" w:w="80"/>
+              <w:right w:type="dxa" w:w="120"/>
+            </w:tcMar>
+          </w:tcPr>
+          <w:p>
+            <w:pPr>
+              <w:spacing w:after="0"/>
+            </w:pPr>
+            <w:r>
+              <w:rPr>
+                <w:b w:val="false"/>
+                <w:bCs w:val="false"/>
+                <w:sz w:val="19"/>
+                <w:szCs w:val="19"/>
+              </w:rPr>
+              <w:t xml:space="preserve">Foundation</w:t>
+            </w:r>
+          </w:p>
+        </w:tc>
+      </w:tr>
+      <w:tr>
+        <w:tc>
+          <w:tcPr>
+            <w:tcW w:type="dxa" w:w="4600"/>
+            <w:tcMar>
+              <w:top w:type="dxa" w:w="80"/>
+              <w:left w:type="dxa" w:w="120"/>
+              <w:bottom w:type="dxa" w:w="80"/>
+              <w:right w:type="dxa" w:w="120"/>
+            </w:tcMar>
+          </w:tcPr>
+          <w:p>
+            <w:pPr>
+              <w:spacing w:after="0"/>
+            </w:pPr>
+            <w:r>
+              <w:rPr>
+                <w:b w:val="false"/>
+                <w:bCs w:val="false"/>
+                <w:sz w:val="19"/>
+                <w:szCs w:val="19"/>
+              </w:rPr>
+              <w:t xml:space="preserve">M02 — Event and Operation Foundation</w:t>
+            </w:r>
+          </w:p>
+        </w:tc>
+        <w:tc>
+          <w:tcPr>
+            <w:tcW w:type="dxa" w:w="1500"/>
+            <w:tcMar>
+              <w:top w:type="dxa" w:w="80"/>
+              <w:left w:type="dxa" w:w="120"/>
+              <w:bottom w:type="dxa" w:w="80"/>
+              <w:right w:type="dxa" w:w="120"/>
+            </w:tcMar>
+          </w:tcPr>
+          <w:p>
+            <w:pPr>
+              <w:spacing w:after="0"/>
+            </w:pPr>
+            <w:r>
+              <w:rPr>
+                <w:b w:val="false"/>
+                <w:bCs w:val="false"/>
+                <w:sz w:val="19"/>
+                <w:szCs w:val="19"/>
+              </w:rPr>
+              <w:t xml:space="preserve">4 – 7</w:t>
+            </w:r>
+          </w:p>
+        </w:tc>
+        <w:tc>
+          <w:tcPr>
+            <w:tcW w:type="dxa" w:w="3260"/>
+            <w:tcMar>
+              <w:top w:type="dxa" w:w="80"/>
+              <w:left w:type="dxa" w:w="120"/>
+              <w:bottom w:type="dxa" w:w="80"/>
+              <w:right w:type="dxa" w:w="120"/>
+            </w:tcMar>
+          </w:tcPr>
+          <w:p>
+            <w:pPr>
+              <w:spacing w:after="0"/>
+            </w:pPr>
+            <w:r>
+              <w:rPr>
+                <w:b w:val="false"/>
+                <w:bCs w:val="false"/>
+                <w:sz w:val="19"/>
+                <w:szCs w:val="19"/>
+              </w:rPr>
+              <w:t xml:space="preserve">Foundation</w:t>
+            </w:r>
+          </w:p>
+        </w:tc>
+      </w:tr>
+      <w:tr>
+        <w:tc>
+          <w:tcPr>
+            <w:tcW w:type="dxa" w:w="4600"/>
+            <w:tcMar>
+              <w:top w:type="dxa" w:w="80"/>
+              <w:left w:type="dxa" w:w="120"/>
+              <w:bottom w:type="dxa" w:w="80"/>
+              <w:right w:type="dxa" w:w="120"/>
+            </w:tcMar>
+          </w:tcPr>
+          <w:p>
+            <w:pPr>
+              <w:spacing w:after="0"/>
+            </w:pPr>
+            <w:r>
+              <w:rPr>
+                <w:b w:val="false"/>
+                <w:bCs w:val="false"/>
+                <w:sz w:val="19"/>
+                <w:szCs w:val="19"/>
+              </w:rPr>
+              <w:t xml:space="preserve">M03 — Webhook inbox and worker runtime</w:t>
+            </w:r>
+          </w:p>
+        </w:tc>
+        <w:tc>
+          <w:tcPr>
+            <w:tcW w:type="dxa" w:w="1500"/>
+            <w:tcMar>
+              <w:top w:type="dxa" w:w="80"/>
+              <w:left w:type="dxa" w:w="120"/>
+              <w:bottom w:type="dxa" w:w="80"/>
+              <w:right w:type="dxa" w:w="120"/>
+            </w:tcMar>
+          </w:tcPr>
+          <w:p>
+            <w:pPr>
+              <w:spacing w:after="0"/>
+            </w:pPr>
+            <w:r>
+              <w:rPr>
+                <w:b w:val="false"/>
+                <w:bCs w:val="false"/>
+                <w:sz w:val="19"/>
+                <w:szCs w:val="19"/>
+              </w:rPr>
+              <w:t xml:space="preserve">3 – 5</w:t>
+            </w:r>
+          </w:p>
+        </w:tc>
+        <w:tc>
+          <w:tcPr>
+            <w:tcW w:type="dxa" w:w="3260"/>
+            <w:tcMar>
+              <w:top w:type="dxa" w:w="80"/>
+              <w:left w:type="dxa" w:w="120"/>
+              <w:bottom w:type="dxa" w:w="80"/>
+              <w:right w:type="dxa" w:w="120"/>
+            </w:tcMar>
+          </w:tcPr>
+          <w:p>
+            <w:pPr>
+              <w:spacing w:after="0"/>
+            </w:pPr>
+            <w:r>
+              <w:rPr>
+                <w:b w:val="false"/>
+                <w:bCs w:val="false"/>
+                <w:sz w:val="19"/>
+                <w:szCs w:val="19"/>
+              </w:rPr>
+              <w:t xml:space="preserve">Foundation</w:t>
+            </w:r>
+          </w:p>
+        </w:tc>
+      </w:tr>
+      <w:tr>
+        <w:tc>
+          <w:tcPr>
+            <w:tcW w:type="dxa" w:w="4600"/>
+            <w:tcMar>
+              <w:top w:type="dxa" w:w="80"/>
+              <w:left w:type="dxa" w:w="120"/>
+              <w:bottom w:type="dxa" w:w="80"/>
+              <w:right w:type="dxa" w:w="120"/>
+            </w:tcMar>
+          </w:tcPr>
+          <w:p>
+            <w:pPr>
+              <w:spacing w:after="0"/>
+            </w:pPr>
+            <w:r>
+              <w:rPr>
+                <w:b w:val="false"/>
+                <w:bCs w:val="false"/>
+                <w:sz w:val="19"/>
+                <w:szCs w:val="19"/>
+              </w:rPr>
+              <w:t xml:space="preserve">M04 — Tenant and provider routing</w:t>
+            </w:r>
+          </w:p>
+        </w:tc>
+        <w:tc>
+          <w:tcPr>
+            <w:tcW w:type="dxa" w:w="1500"/>
+            <w:tcMar>
+              <w:top w:type="dxa" w:w="80"/>
+              <w:left w:type="dxa" w:w="120"/>
+              <w:bottom w:type="dxa" w:w="80"/>
+              <w:right w:type="dxa" w:w="120"/>
+            </w:tcMar>
+          </w:tcPr>
+          <w:p>
+            <w:pPr>
+              <w:spacing w:after="0"/>
+            </w:pPr>
+            <w:r>
+              <w:rPr>
+                <w:b w:val="false"/>
+                <w:bCs w:val="false"/>
+                <w:sz w:val="19"/>
+                <w:szCs w:val="19"/>
+              </w:rPr>
+              <w:t xml:space="preserve">2 – 4</w:t>
+            </w:r>
+          </w:p>
+        </w:tc>
+        <w:tc>
+          <w:tcPr>
+            <w:tcW w:type="dxa" w:w="3260"/>
+            <w:tcMar>
+              <w:top w:type="dxa" w:w="80"/>
+              <w:left w:type="dxa" w:w="120"/>
+              <w:bottom w:type="dxa" w:w="80"/>
+              <w:right w:type="dxa" w:w="120"/>
+            </w:tcMar>
+          </w:tcPr>
+          <w:p>
+            <w:pPr>
+              <w:spacing w:after="0"/>
+            </w:pPr>
+            <w:r>
+              <w:rPr>
+                <w:b w:val="false"/>
+                <w:bCs w:val="false"/>
+                <w:sz w:val="19"/>
+                <w:szCs w:val="19"/>
+              </w:rPr>
+              <w:t xml:space="preserve">Foundation</w:t>
+            </w:r>
+          </w:p>
+        </w:tc>
+      </w:tr>
+      <w:tr>
+        <w:tc>
+          <w:tcPr>
+            <w:tcW w:type="dxa" w:w="4600"/>
+            <w:tcMar>
+              <w:top w:type="dxa" w:w="80"/>
+              <w:left w:type="dxa" w:w="120"/>
+              <w:bottom w:type="dxa" w:w="80"/>
+              <w:right w:type="dxa" w:w="120"/>
+            </w:tcMar>
+          </w:tcPr>
+          <w:p>
+            <w:pPr>
+              <w:spacing w:after="0"/>
+            </w:pPr>
+            <w:r>
+              <w:rPr>
+                <w:b w:val="false"/>
+                <w:bCs w:val="false"/>
+                <w:sz w:val="19"/>
+                <w:szCs w:val="19"/>
+              </w:rPr>
+              <w:t xml:space="preserve">M05 — Work and error queues</w:t>
+            </w:r>
+          </w:p>
+        </w:tc>
+        <w:tc>
+          <w:tcPr>
+            <w:tcW w:type="dxa" w:w="1500"/>
+            <w:tcMar>
+              <w:top w:type="dxa" w:w="80"/>
+              <w:left w:type="dxa" w:w="120"/>
+              <w:bottom w:type="dxa" w:w="80"/>
+              <w:right w:type="dxa" w:w="120"/>
+            </w:tcMar>
+          </w:tcPr>
+          <w:p>
+            <w:pPr>
+              <w:spacing w:after="0"/>
+            </w:pPr>
+            <w:r>
+              <w:rPr>
+                <w:b w:val="false"/>
+                <w:bCs w:val="false"/>
+                <w:sz w:val="19"/>
+                <w:szCs w:val="19"/>
+              </w:rPr>
+              <w:t xml:space="preserve">3 – 5</w:t>
+            </w:r>
+          </w:p>
+        </w:tc>
+        <w:tc>
+          <w:tcPr>
+            <w:tcW w:type="dxa" w:w="3260"/>
+            <w:tcMar>
+              <w:top w:type="dxa" w:w="80"/>
+              <w:left w:type="dxa" w:w="120"/>
+              <w:bottom w:type="dxa" w:w="80"/>
+              <w:right w:type="dxa" w:w="120"/>
+            </w:tcMar>
+          </w:tcPr>
+          <w:p>
+            <w:pPr>
+              <w:spacing w:after="0"/>
+            </w:pPr>
+            <w:r>
+              <w:rPr>
+                <w:b w:val="false"/>
+                <w:bCs w:val="false"/>
+                <w:sz w:val="19"/>
+                <w:szCs w:val="19"/>
+              </w:rPr>
+              <w:t xml:space="preserve">Foundation</w:t>
+            </w:r>
+          </w:p>
+        </w:tc>
+      </w:tr>
+      <w:tr>
+        <w:tc>
+          <w:tcPr>
+            <w:tcW w:type="dxa" w:w="4600"/>
+            <w:tcMar>
+              <w:top w:type="dxa" w:w="80"/>
+              <w:left w:type="dxa" w:w="120"/>
+              <w:bottom w:type="dxa" w:w="80"/>
+              <w:right w:type="dxa" w:w="120"/>
+            </w:tcMar>
+          </w:tcPr>
+          <w:p>
+            <w:pPr>
+              <w:spacing w:after="0"/>
+            </w:pPr>
+            <w:r>
+              <w:rPr>
+                <w:b w:val="false"/>
+                <w:bCs w:val="false"/>
+                <w:sz w:val="19"/>
+                <w:szCs w:val="19"/>
+              </w:rPr>
+              <w:t xml:space="preserve">M06 — Outbound operation and batch runtime</w:t>
+            </w:r>
+          </w:p>
+        </w:tc>
+        <w:tc>
+          <w:tcPr>
+            <w:tcW w:type="dxa" w:w="1500"/>
+            <w:tcMar>
+              <w:top w:type="dxa" w:w="80"/>
+              <w:left w:type="dxa" w:w="120"/>
+              <w:bottom w:type="dxa" w:w="80"/>
+              <w:right w:type="dxa" w:w="120"/>
+            </w:tcMar>
+          </w:tcPr>
+          <w:p>
+            <w:pPr>
+              <w:spacing w:after="0"/>
+            </w:pPr>
+            <w:r>
+              <w:rPr>
+                <w:b w:val="false"/>
+                <w:bCs w:val="false"/>
+                <w:sz w:val="19"/>
+                <w:szCs w:val="19"/>
+              </w:rPr>
+              <w:t xml:space="preserve">4 – 6</w:t>
+            </w:r>
+          </w:p>
+        </w:tc>
+        <w:tc>
+          <w:tcPr>
+            <w:tcW w:type="dxa" w:w="3260"/>
+            <w:tcMar>
+              <w:top w:type="dxa" w:w="80"/>
+              <w:left w:type="dxa" w:w="120"/>
+              <w:bottom w:type="dxa" w:w="80"/>
+              <w:right w:type="dxa" w:w="120"/>
+            </w:tcMar>
+          </w:tcPr>
+          <w:p>
+            <w:pPr>
+              <w:spacing w:after="0"/>
+            </w:pPr>
+            <w:r>
+              <w:rPr>
+                <w:b w:val="false"/>
+                <w:bCs w:val="false"/>
+                <w:sz w:val="19"/>
+                <w:szCs w:val="19"/>
+              </w:rPr>
+              <w:t xml:space="preserve">Foundation</w:t>
+            </w:r>
+          </w:p>
+        </w:tc>
+      </w:tr>
+      <w:tr>
+        <w:tc>
+          <w:tcPr>
+            <w:tcW w:type="dxa" w:w="4600"/>
+            <w:tcMar>
+              <w:top w:type="dxa" w:w="80"/>
+              <w:left w:type="dxa" w:w="120"/>
+              <w:bottom w:type="dxa" w:w="80"/>
+              <w:right w:type="dxa" w:w="120"/>
+            </w:tcMar>
+          </w:tcPr>
+          <w:p>
+            <w:pPr>
+              <w:spacing w:after="0"/>
+            </w:pPr>
+            <w:r>
+              <w:rPr>
+                <w:b w:val="false"/>
+                <w:bCs w:val="false"/>
+                <w:sz w:val="19"/>
+                <w:szCs w:val="19"/>
+              </w:rPr>
+              <w:t xml:space="preserve">One workflow module (M07, the least expensive of the four)</w:t>
+            </w:r>
+          </w:p>
+        </w:tc>
+        <w:tc>
+          <w:tcPr>
+            <w:tcW w:type="dxa" w:w="1500"/>
+            <w:tcMar>
+              <w:top w:type="dxa" w:w="80"/>
+              <w:left w:type="dxa" w:w="120"/>
+              <w:bottom w:type="dxa" w:w="80"/>
+              <w:right w:type="dxa" w:w="120"/>
+            </w:tcMar>
+          </w:tcPr>
+          <w:p>
+            <w:pPr>
+              <w:spacing w:after="0"/>
+            </w:pPr>
+            <w:r>
+              <w:rPr>
+                <w:b w:val="false"/>
+                <w:bCs w:val="false"/>
+                <w:sz w:val="19"/>
+                <w:szCs w:val="19"/>
+              </w:rPr>
+              <w:t xml:space="preserve">3 – 5</w:t>
+            </w:r>
+          </w:p>
+        </w:tc>
+        <w:tc>
+          <w:tcPr>
+            <w:tcW w:type="dxa" w:w="3260"/>
+            <w:tcMar>
+              <w:top w:type="dxa" w:w="80"/>
+              <w:left w:type="dxa" w:w="120"/>
+              <w:bottom w:type="dxa" w:w="80"/>
+              <w:right w:type="dxa" w:w="120"/>
+            </w:tcMar>
+          </w:tcPr>
+          <w:p>
+            <w:pPr>
+              <w:spacing w:after="0"/>
+            </w:pPr>
+            <w:r>
+              <w:rPr>
+                <w:b w:val="false"/>
+                <w:bCs w:val="false"/>
+                <w:sz w:val="19"/>
+                <w:szCs w:val="19"/>
+              </w:rPr>
+              <w:t xml:space="preserve">Workflow</w:t>
+            </w:r>
+          </w:p>
+        </w:tc>
+      </w:tr>
+      <w:tr>
+        <w:tc>
+          <w:tcPr>
+            <w:tcW w:type="dxa" w:w="4600"/>
+            <w:tcMar>
+              <w:top w:type="dxa" w:w="80"/>
+              <w:left w:type="dxa" w:w="120"/>
+              <w:bottom w:type="dxa" w:w="80"/>
+              <w:right w:type="dxa" w:w="120"/>
+            </w:tcMar>
+          </w:tcPr>
+          <w:p>
+            <w:pPr>
+              <w:spacing w:after="0"/>
+            </w:pPr>
+            <w:r>
+              <w:rPr>
+                <w:b w:val="false"/>
+                <w:bCs w:val="false"/>
+                <w:sz w:val="19"/>
+                <w:szCs w:val="19"/>
+              </w:rPr>
+              <w:t xml:space="preserve">Minimum M10 staff-facing surface</w:t>
+            </w:r>
+          </w:p>
+        </w:tc>
+        <w:tc>
+          <w:tcPr>
+            <w:tcW w:type="dxa" w:w="1500"/>
+            <w:tcMar>
+              <w:top w:type="dxa" w:w="80"/>
+              <w:left w:type="dxa" w:w="120"/>
+              <w:bottom w:type="dxa" w:w="80"/>
+              <w:right w:type="dxa" w:w="120"/>
+            </w:tcMar>
+          </w:tcPr>
+          <w:p>
+            <w:pPr>
+              <w:spacing w:after="0"/>
+            </w:pPr>
+            <w:r>
+              <w:rPr>
+                <w:b w:val="false"/>
+                <w:bCs w:val="false"/>
+                <w:sz w:val="19"/>
+                <w:szCs w:val="19"/>
+              </w:rPr>
+              <w:t xml:space="preserve">3 – 6</w:t>
+            </w:r>
+          </w:p>
+        </w:tc>
+        <w:tc>
+          <w:tcPr>
+            <w:tcW w:type="dxa" w:w="3260"/>
+            <w:tcMar>
+              <w:top w:type="dxa" w:w="80"/>
+              <w:left w:type="dxa" w:w="120"/>
+              <w:bottom w:type="dxa" w:w="80"/>
+              <w:right w:type="dxa" w:w="120"/>
+            </w:tcMar>
+          </w:tcPr>
+          <w:p>
+            <w:pPr>
+              <w:spacing w:after="0"/>
+            </w:pPr>
+            <w:r>
+              <w:rPr>
+                <w:b w:val="false"/>
+                <w:bCs w:val="false"/>
+                <w:sz w:val="19"/>
+                <w:szCs w:val="19"/>
+              </w:rPr>
+              <w:t xml:space="preserve">Foundation</w:t>
+            </w:r>
+          </w:p>
+        </w:tc>
+      </w:tr>
+      <w:tr>
+        <w:tc>
+          <w:tcPr>
+            <w:tcW w:type="dxa" w:w="4600"/>
+            <w:tcMar>
+              <w:top w:type="dxa" w:w="80"/>
+              <w:left w:type="dxa" w:w="120"/>
+              <w:bottom w:type="dxa" w:w="80"/>
+              <w:right w:type="dxa" w:w="120"/>
+            </w:tcMar>
+          </w:tcPr>
+          <w:p>
+            <w:pPr>
+              <w:spacing w:after="0"/>
+            </w:pPr>
+            <w:r>
+              <w:rPr>
+                <w:b w:val="false"/>
+                <w:bCs w:val="false"/>
+                <w:sz w:val="19"/>
+                <w:szCs w:val="19"/>
+              </w:rPr>
+              <w:t xml:space="preserve">M11 slice needed to operate it safely</w:t>
+            </w:r>
+          </w:p>
+        </w:tc>
+        <w:tc>
+          <w:tcPr>
+            <w:tcW w:type="dxa" w:w="1500"/>
+            <w:tcMar>
+              <w:top w:type="dxa" w:w="80"/>
+              <w:left w:type="dxa" w:w="120"/>
+              <w:bottom w:type="dxa" w:w="80"/>
+              <w:right w:type="dxa" w:w="120"/>
+            </w:tcMar>
+          </w:tcPr>
+          <w:p>
+            <w:pPr>
+              <w:spacing w:after="0"/>
+            </w:pPr>
+            <w:r>
+              <w:rPr>
+                <w:b w:val="false"/>
+                <w:bCs w:val="false"/>
+                <w:sz w:val="19"/>
+                <w:szCs w:val="19"/>
+              </w:rPr>
+              <w:t xml:space="preserve">3 – 5</w:t>
+            </w:r>
+          </w:p>
+        </w:tc>
+        <w:tc>
+          <w:tcPr>
+            <w:tcW w:type="dxa" w:w="3260"/>
+            <w:tcMar>
+              <w:top w:type="dxa" w:w="80"/>
+              <w:left w:type="dxa" w:w="120"/>
+              <w:bottom w:type="dxa" w:w="80"/>
+              <w:right w:type="dxa" w:w="120"/>
+            </w:tcMar>
+          </w:tcPr>
+          <w:p>
+            <w:pPr>
+              <w:spacing w:after="0"/>
+            </w:pPr>
+            <w:r>
+              <w:rPr>
+                <w:b w:val="false"/>
+                <w:bCs w:val="false"/>
+                <w:sz w:val="19"/>
+                <w:szCs w:val="19"/>
+              </w:rPr>
+              <w:t xml:space="preserve">Foundation</w:t>
+            </w:r>
+          </w:p>
+        </w:tc>
+      </w:tr>
+      <w:tr>
+        <w:tc>
+          <w:tcPr>
+            <w:tcW w:type="dxa" w:w="4600"/>
+            <w:tcMar>
+              <w:top w:type="dxa" w:w="80"/>
+              <w:left w:type="dxa" w:w="120"/>
+              <w:bottom w:type="dxa" w:w="80"/>
+              <w:right w:type="dxa" w:w="120"/>
+            </w:tcMar>
+          </w:tcPr>
+          <w:p>
+            <w:pPr>
+              <w:spacing w:after="0"/>
+            </w:pPr>
+            <w:r>
+              <w:rPr>
+                <w:b w:val="false"/>
+                <w:bCs w:val="false"/>
+                <w:sz w:val="19"/>
+                <w:szCs w:val="19"/>
+              </w:rPr>
+              <w:t xml:space="preserve">Total</w:t>
+            </w:r>
+          </w:p>
+        </w:tc>
+        <w:tc>
+          <w:tcPr>
+            <w:tcW w:type="dxa" w:w="1500"/>
+            <w:tcMar>
+              <w:top w:type="dxa" w:w="80"/>
+              <w:left w:type="dxa" w:w="120"/>
+              <w:bottom w:type="dxa" w:w="80"/>
+              <w:right w:type="dxa" w:w="120"/>
+            </w:tcMar>
+          </w:tcPr>
+          <w:p>
+            <w:pPr>
+              <w:spacing w:after="0"/>
+            </w:pPr>
+            <w:r>
+              <w:rPr>
+                <w:b w:val="false"/>
+                <w:bCs w:val="false"/>
+                <w:sz w:val="19"/>
+                <w:szCs w:val="19"/>
+              </w:rPr>
+              <w:t xml:space="preserve">30 – 52</w:t>
+            </w:r>
+          </w:p>
+        </w:tc>
+        <w:tc>
+          <w:tcPr>
+            <w:tcW w:type="dxa" w:w="3260"/>
+            <w:tcMar>
+              <w:top w:type="dxa" w:w="80"/>
+              <w:left w:type="dxa" w:w="120"/>
+              <w:bottom w:type="dxa" w:w="80"/>
+              <w:right w:type="dxa" w:w="120"/>
+            </w:tcMar>
+          </w:tcPr>
+          <w:p>
+            <w:pPr>
+              <w:spacing w:after="0"/>
+            </w:pPr>
+            <w:r>
+              <w:rPr>
+                <w:b w:val="false"/>
+                <w:bCs w:val="false"/>
+                <w:sz w:val="19"/>
+                <w:szCs w:val="19"/>
+              </w:rPr>
+              <w:t xml:space="preserve">—</w:t>
+            </w:r>
+          </w:p>
+        </w:tc>
+      </w:tr>
+    </w:tbl>
+    <w:p>
+      <w:pPr>
+        <w:spacing w:after="120"/>
+      </w:pPr>
+      <w:r>
+        <w:t xml:space="preserve">The workflow itself accounts for only three to five weeks. Roughly 85 per cent of the figure is infrastructure that must exist before any workflow can run, and that ordering is not an assumption imposed here — it follows the dependency register in the module tracker, where M07 depends on M03, M04, M05 and M06, which in turn depend on M01 and M02. Seven modules sit ahead of the first workflow by design.</w:t>
+      </w:r>
+    </w:p>
+    <w:p>
+      <w:pPr>
+        <w:spacing w:after="120"/>
+      </w:pPr>
+      <w:r>
+        <w:t xml:space="preserve">The reason is a deliberate architectural choice already taken: M01 is tenant isolation, and the programme builds a multi-tenant, PHI-grade platform first and the workflows last. This front-loads cost onto the first clinic and makes every subsequent clinic cheap. It is the decision that avoids building a single-clinic prototype and then rewriting it into a product.</w:t>
+      </w:r>
+    </w:p>
+    <w:p>
+      <w:pPr>
+        <w:spacing w:after="120"/>
+      </w:pPr>
+      <w:r>
+        <w:t xml:space="preserve">If the near-term goal were one pilot clinic rather than a sellable multi-tenant service, several components could be reduced to pilot grade: M04 is largely degenerate with a single tenant; M06 is sized for concurrency and volume that one clinic may not generate initially; parts of M01 production readiness concern operating a service rather than running one pilot; and the M11 slice could be thinner. That could plausibly bring P1 to roughly 20–35 engineering weeks.</w:t>
+      </w:r>
+    </w:p>
+    <w:p>
+      <w:pPr>
+        <w:spacing w:after="120"/>
+      </w:pPr>
+      <w:r>
+        <w:rPr>
+          <w:i/>
+          <w:iCs/>
+          <w:sz w:val="20"/>
+          <w:szCs w:val="20"/>
+        </w:rPr>
+        <w:t xml:space="preserve">Each of those reductions is deferred work that would have to be repaid before the second clinic, and avoiding precisely that debt is why M01 exists. The trade is recorded here rather than recommended. The more useful observation is that the demo (D1) requires none of this foundation, so contact with clinics need not wait on P1 at all.</w:t>
       </w:r>
     </w:p>
     <w:p>

</xml_diff>